<commit_message>
Tạo nhánh develop để phát triển tính năng
</commit_message>
<xml_diff>
--- a/docs/Báo cáo tuần 23_9 tới 4_10.docx
+++ b/docs/Báo cáo tuần 23_9 tới 4_10.docx
@@ -2,6 +2,40 @@
 <file path=word/document.xml><?xml version="1.0" encoding="utf-8"?>
 <w:document xmlns:wpc="http://schemas.microsoft.com/office/word/2010/wordprocessingCanvas" xmlns:cx="http://schemas.microsoft.com/office/drawing/2014/chartex" xmlns:cx1="http://schemas.microsoft.com/office/drawing/2015/9/8/chartex" xmlns:cx2="http://schemas.microsoft.com/office/drawing/2015/10/21/chartex" xmlns:cx3="http://schemas.microsoft.com/office/drawing/2016/5/9/chartex" xmlns:cx4="http://schemas.microsoft.com/office/drawing/2016/5/10/chartex" xmlns:cx5="http://schemas.microsoft.com/office/drawing/2016/5/11/chartex" xmlns:cx6="http://schemas.microsoft.com/office/drawing/2016/5/12/chartex" xmlns:cx7="http://schemas.microsoft.com/office/drawing/2016/5/13/chartex" xmlns:cx8="http://schemas.microsoft.com/office/drawing/2016/5/14/chartex" xmlns:mc="http://schemas.openxmlformats.org/markup-compatibility/2006" xmlns:aink="http://schemas.microsoft.com/office/drawing/2016/ink" xmlns:am3d="http://schemas.microsoft.com/office/drawing/2017/model3d" xmlns:o="urn:schemas-microsoft-com:office:office" xmlns:oel="http://schemas.microsoft.com/office/2019/extlst" xmlns:r="http://schemas.openxmlformats.org/officeDocument/2006/relationships" xmlns:m="http://schemas.openxmlformats.org/officeDocument/2006/math" xmlns:v="urn:schemas-microsoft-com:vml" xmlns:wp14="http://schemas.microsoft.com/office/word/2010/wordprocessingDrawing" xmlns:wp="http://schemas.openxmlformats.org/drawingml/2006/wordprocessingDrawing" xmlns:w10="urn:schemas-microsoft-com:office:word" xmlns:w="http://schemas.openxmlformats.org/wordprocessingml/2006/main" xmlns:w14="http://schemas.microsoft.com/office/word/2010/wordml" xmlns:w15="http://schemas.microsoft.com/office/word/2012/wordml" xmlns:w16cex="http://schemas.microsoft.com/office/word/2018/wordml/cex" xmlns:w16cid="http://schemas.microsoft.com/office/word/2016/wordml/cid" xmlns:w16="http://schemas.microsoft.com/office/word/2018/wordml" xmlns:w16du="http://schemas.microsoft.com/office/word/2023/wordml/word16du" xmlns:w16sdtdh="http://schemas.microsoft.com/office/word/2020/wordml/sdtdatahash" xmlns:w16sdtfl="http://schemas.microsoft.com/office/word/2024/wordml/sdtformatlock" xmlns:w16se="http://schemas.microsoft.com/office/word/2015/wordml/symex" xmlns:wpg="http://schemas.microsoft.com/office/word/2010/wordprocessingGroup" xmlns:wpi="http://schemas.microsoft.com/office/word/2010/wordprocessingInk" xmlns:wne="http://schemas.microsoft.com/office/word/2006/wordml" xmlns:wps="http://schemas.microsoft.com/office/word/2010/wordprocessingShape" mc:Ignorable="w14 w15 w16se w16cid w16 w16cex w16sdtdh w16sdtfl w16du wp14">
   <w:body>
+    <w:p>
+      <w:pPr>
+        <w:pStyle w:val="New1"/>
+      </w:pPr>
+      <w:r>
+        <w:t>1 abc</w:t>
+      </w:r>
+    </w:p>
+    <w:p>
+      <w:pPr>
+        <w:pStyle w:val="medium"/>
+      </w:pPr>
+      <w:r>
+        <w:t>2 def</w:t>
+      </w:r>
+    </w:p>
+    <w:p>
+      <w:pPr>
+        <w:pStyle w:val="low12"/>
+      </w:pPr>
+      <w:r>
+        <w:t>3 ghi</w:t>
+      </w:r>
+    </w:p>
+    <w:p>
+      <w:pPr>
+        <w:spacing w:after="160" w:line="278" w:lineRule="auto"/>
+        <w:rPr>
+          <w:rFonts w:cs="Times New Roman"/>
+          <w:sz w:val="40"/>
+          <w:szCs w:val="40"/>
+        </w:rPr>
+      </w:pPr>
+    </w:p>
     <w:p>
       <w:pPr>
         <w:spacing w:after="40" w:line="360" w:lineRule="auto"/>
@@ -229,6 +263,7 @@
         <w:pStyle w:val="low12"/>
       </w:pPr>
       <w:r>
+        <w:lastRenderedPageBreak/>
         <w:t>$ne</w:t>
       </w:r>
       <w:r>
@@ -281,11 +316,7 @@
         <w:pStyle w:val="low12"/>
       </w:pPr>
       <w:r>
-        <w:t xml:space="preserve">Lúc này, hệ thống backend sẽ dịch câu lệnh thành: "Tìm tài khoản có username là admin VÀ mật khẩu khác null". Rõ ràng mật khẩu của admin được lưu trong </w:t>
-      </w:r>
-      <w:r>
-        <w:lastRenderedPageBreak/>
-        <w:t>database chắc chắn tồn tại (luôn khác null), do đó điều kiện này tự động ĐÚNG.</w:t>
+        <w:t>Lúc này, hệ thống backend sẽ dịch câu lệnh thành: "Tìm tài khoản có username là admin VÀ mật khẩu khác null". Rõ ràng mật khẩu của admin được lưu trong database chắc chắn tồn tại (luôn khác null), do đó điều kiện này tự động ĐÚNG.</w:t>
       </w:r>
       <w:r>
         <w:t xml:space="preserve"> </w:t>
@@ -396,7 +427,11 @@
         <w:t xml:space="preserve">: </w:t>
       </w:r>
       <w:r>
-        <w:t>thao tác truyền mã độc thông qua các khu vực input ít sự quản lý bao gồm (dòng bình luận, đánh giá, tạo ý kiến,…). Bằng cách gửi và chèn script độc hại viết dưới dạng Javascript và HTML,</w:t>
+        <w:t xml:space="preserve">thao tác truyền mã độc thông qua các khu vực input ít sự quản lý bao gồm (dòng bình luận, đánh giá, tạo ý kiến,…). Bằng </w:t>
+      </w:r>
+      <w:r>
+        <w:lastRenderedPageBreak/>
+        <w:t>cách gửi và chèn script độc hại viết dưới dạng Javascript và HTML,</w:t>
       </w:r>
       <w:r>
         <w:t xml:space="preserve"> có ba thể loại tấn công cơ bản là </w:t>
@@ -426,7 +461,6 @@
         <w:pStyle w:val="low12"/>
       </w:pPr>
       <w:r>
-        <w:lastRenderedPageBreak/>
         <w:t>DOM Based XSS (tấn công thông qua các thẻ div, HTML</w:t>
       </w:r>
       <w:r>
@@ -538,7 +572,11 @@
         <w:t xml:space="preserve">: </w:t>
       </w:r>
       <w:r>
-        <w:t xml:space="preserve">thuộc về lỗ hổng kiểm soát truy cập. Nguồn gốc xảy ra khi một ứng dụng web cho phép truy cập trực tiếp tới đối tượng dữ liệu mà người dùng cung cấp. Việc website truy cập không phân quyền tạo nền tảng cho các việc truy cập tham chiếu trái phép từ hacker. Vd: như đều trên một csdl </w:t>
+        <w:t xml:space="preserve">thuộc về lỗ hổng kiểm soát truy cập. Nguồn gốc xảy ra khi một ứng dụng web cho phép truy cập trực tiếp tới đối tượng dữ liệu mà người dùng cung cấp. Việc website truy cập không phân quyền tạo nền tảng cho các việc truy cập tham chiếu trái phép từ hacker. Vd: </w:t>
+      </w:r>
+      <w:r>
+        <w:lastRenderedPageBreak/>
+        <w:t xml:space="preserve">như đều trên một csdl </w:t>
       </w:r>
       <w:r>
         <w:t>nhưng cả 2 đều có ID khác biệt nhau là 1002 và 1005. Nếu như không phân quyền rõ ràng kiểm soát việc truy cập của User thì cả 2 đều có thể đọc được cả dữ liệu của nhau, về sau có thêm người thì càng ngày càng tăng dần.</w:t>
@@ -565,7 +603,6 @@
         <w:rPr>
           <w:noProof/>
         </w:rPr>
-        <w:lastRenderedPageBreak/>
         <w:drawing>
           <wp:inline distT="0" distB="0" distL="0" distR="0" wp14:anchorId="49E03A72" wp14:editId="363F8C5D">
             <wp:extent cx="5943600" cy="1960880"/>
@@ -673,6 +710,7 @@
         <w:pStyle w:val="low12"/>
       </w:pPr>
       <w:r>
+        <w:lastRenderedPageBreak/>
         <w:t>Bot</w:t>
       </w:r>
       <w:r>
@@ -709,7 +747,6 @@
         <w:rPr>
           <w:noProof/>
         </w:rPr>
-        <w:lastRenderedPageBreak/>
         <w:drawing>
           <wp:inline distT="0" distB="0" distL="0" distR="0" wp14:anchorId="6D8C5126" wp14:editId="3494EA28">
             <wp:extent cx="5943600" cy="1842770"/>
@@ -804,6 +841,7 @@
         <w:rPr>
           <w:noProof/>
         </w:rPr>
+        <w:lastRenderedPageBreak/>
         <w:drawing>
           <wp:inline distT="0" distB="0" distL="0" distR="0" wp14:anchorId="79A827F9" wp14:editId="5C3A7FFC">
             <wp:extent cx="5943600" cy="2331085"/>
@@ -873,7 +911,6 @@
         <w:pStyle w:val="medium"/>
       </w:pPr>
       <w:r>
-        <w:lastRenderedPageBreak/>
         <w:t>Alert.js: bao gồm các cảnh báo giả dùng cho các trường hợp sản sinh ra để</w:t>
       </w:r>
       <w:r>
@@ -984,7 +1021,9 @@
       <w:r>
         <w:rPr>
           <w:rFonts w:cs="Times New Roman"/>
-        </w:rPr>
+          <w:noProof/>
+        </w:rPr>
+        <w:lastRenderedPageBreak/>
         <w:drawing>
           <wp:inline distT="0" distB="0" distL="0" distR="0" wp14:anchorId="79455FE4" wp14:editId="1B90EAD3">
             <wp:extent cx="5943600" cy="2712085"/>
@@ -1112,6 +1151,9 @@
         <w:jc w:val="center"/>
       </w:pPr>
       <w:r>
+        <w:rPr>
+          <w:noProof/>
+        </w:rPr>
         <w:drawing>
           <wp:inline distT="0" distB="0" distL="0" distR="0" wp14:anchorId="6CAA9808" wp14:editId="679768DC">
             <wp:extent cx="4671465" cy="3353091"/>
@@ -1207,24 +1249,15 @@
         <w:pStyle w:val="low12"/>
       </w:pPr>
       <w:r>
-        <w:t xml:space="preserve">recipients: </w:t>
-      </w:r>
-      <w:r>
-        <w:t>d</w:t>
-      </w:r>
-      <w:r>
-        <w:t>anh sách email người nhận mặc định</w:t>
-      </w:r>
-    </w:p>
-    <w:p>
-      <w:pPr>
-        <w:pStyle w:val="low12"/>
-      </w:pPr>
-      <w:r>
-        <w:t xml:space="preserve">cc: </w:t>
-      </w:r>
-      <w:r>
-        <w:t xml:space="preserve">danh sách </w:t>
+        <w:t>recipients: danh sách email người nhận mặc định</w:t>
+      </w:r>
+    </w:p>
+    <w:p>
+      <w:pPr>
+        <w:pStyle w:val="low12"/>
+      </w:pPr>
+      <w:r>
+        <w:t xml:space="preserve">cc: danh sách </w:t>
       </w:r>
       <w:r>
         <w:t xml:space="preserve">email người quản lý hoặc bộ phận IT. </w:t>
@@ -1236,6 +1269,9 @@
         <w:jc w:val="center"/>
       </w:pPr>
       <w:r>
+        <w:rPr>
+          <w:noProof/>
+        </w:rPr>
         <w:drawing>
           <wp:inline distT="0" distB="0" distL="0" distR="0" wp14:anchorId="2D398334" wp14:editId="126B39EF">
             <wp:extent cx="4465707" cy="1440305"/>
@@ -1295,69 +1331,39 @@
         <w:pStyle w:val="low12"/>
       </w:pPr>
       <w:r>
-        <w:t xml:space="preserve">username: </w:t>
-      </w:r>
-      <w:r>
-        <w:t>t</w:t>
-      </w:r>
-      <w:r>
-        <w:t>ên hiển thị của người dùng</w:t>
-      </w:r>
-    </w:p>
-    <w:p>
-      <w:pPr>
-        <w:pStyle w:val="low12"/>
-      </w:pPr>
-      <w:r>
-        <w:t xml:space="preserve">email: </w:t>
-      </w:r>
-      <w:r>
-        <w:t>đ</w:t>
-      </w:r>
-      <w:r>
-        <w:t>ịa chỉ email</w:t>
-      </w:r>
-    </w:p>
-    <w:p>
-      <w:pPr>
-        <w:pStyle w:val="low12"/>
-      </w:pPr>
-      <w:r>
-        <w:t xml:space="preserve">password: </w:t>
-      </w:r>
-      <w:r>
-        <w:t>m</w:t>
-      </w:r>
-      <w:r>
-        <w:t>ật khẩu</w:t>
-      </w:r>
-    </w:p>
-    <w:p>
-      <w:pPr>
-        <w:pStyle w:val="low12"/>
-      </w:pPr>
-      <w:r>
-        <w:t xml:space="preserve">role: </w:t>
-      </w:r>
-      <w:r>
-        <w:t>p</w:t>
-      </w:r>
-      <w:r>
-        <w:t>hân quyền người dùng, gồm 2 mức độ (Admin, Viewer)</w:t>
-      </w:r>
-    </w:p>
-    <w:p>
-      <w:pPr>
-        <w:pStyle w:val="low12"/>
-      </w:pPr>
-      <w:r>
-        <w:t xml:space="preserve">resetOtp &amp; resetOtpExpires: </w:t>
-      </w:r>
-      <w:r>
-        <w:t>m</w:t>
-      </w:r>
-      <w:r>
-        <w:t>ã OTP và thời gian hết hạn OTP dùng cho tính năng Quên mật khẩu.</w:t>
+        <w:t>username: tên hiển thị của người dùng</w:t>
+      </w:r>
+    </w:p>
+    <w:p>
+      <w:pPr>
+        <w:pStyle w:val="low12"/>
+      </w:pPr>
+      <w:r>
+        <w:t>email: địa chỉ email</w:t>
+      </w:r>
+    </w:p>
+    <w:p>
+      <w:pPr>
+        <w:pStyle w:val="low12"/>
+      </w:pPr>
+      <w:r>
+        <w:t>password: mật khẩu</w:t>
+      </w:r>
+    </w:p>
+    <w:p>
+      <w:pPr>
+        <w:pStyle w:val="low12"/>
+      </w:pPr>
+      <w:r>
+        <w:t>role: phân quyền người dùng, gồm 2 mức độ (Admin, Viewer)</w:t>
+      </w:r>
+    </w:p>
+    <w:p>
+      <w:pPr>
+        <w:pStyle w:val="low12"/>
+      </w:pPr>
+      <w:r>
+        <w:t>resetOtp &amp; resetOtpExpires: mã OTP và thời gian hết hạn OTP dùng cho tính năng Quên mật khẩu.</w:t>
       </w:r>
     </w:p>
     <w:p>
@@ -1466,10 +1472,7 @@
         <w:pStyle w:val="medium"/>
       </w:pPr>
       <w:r>
-        <w:t>ALERT_TYPES: Chứa danh sách tên của 10 kịch bản tấn công</w:t>
-      </w:r>
-      <w:r>
-        <w:t>.</w:t>
+        <w:t>ALERT_TYPES: Chứa danh sách tên của 10 kịch bản tấn công.</w:t>
       </w:r>
     </w:p>
     <w:p>
@@ -1505,6 +1508,9 @@
         <w:jc w:val="center"/>
       </w:pPr>
       <w:r>
+        <w:rPr>
+          <w:noProof/>
+        </w:rPr>
         <w:drawing>
           <wp:inline distT="0" distB="0" distL="0" distR="0" wp14:anchorId="3A548431" wp14:editId="2386F27B">
             <wp:extent cx="4457700" cy="1540668"/>
@@ -1558,6 +1564,9 @@
         <w:jc w:val="center"/>
       </w:pPr>
       <w:r>
+        <w:rPr>
+          <w:noProof/>
+        </w:rPr>
         <w:drawing>
           <wp:inline distT="0" distB="0" distL="0" distR="0" wp14:anchorId="7D33D9ED" wp14:editId="616026BF">
             <wp:extent cx="2656114" cy="1427378"/>
@@ -1598,6 +1607,9 @@
         <w:t xml:space="preserve"> </w:t>
       </w:r>
       <w:r>
+        <w:rPr>
+          <w:noProof/>
+        </w:rPr>
         <w:drawing>
           <wp:inline distT="0" distB="0" distL="0" distR="0" wp14:anchorId="40D60B45" wp14:editId="4EC0D9F1">
             <wp:extent cx="2531110" cy="1512792"/>
@@ -1635,6 +1647,9 @@
         </w:drawing>
       </w:r>
       <w:r>
+        <w:rPr>
+          <w:noProof/>
+        </w:rPr>
         <w:drawing>
           <wp:inline distT="0" distB="0" distL="0" distR="0" wp14:anchorId="14984609" wp14:editId="739610EE">
             <wp:extent cx="2528570" cy="1595519"/>
@@ -1675,6 +1690,9 @@
         <w:t xml:space="preserve"> </w:t>
       </w:r>
       <w:r>
+        <w:rPr>
+          <w:noProof/>
+        </w:rPr>
         <w:drawing>
           <wp:inline distT="0" distB="0" distL="0" distR="0" wp14:anchorId="67A508DC" wp14:editId="405F1419">
             <wp:extent cx="2653553" cy="1592739"/>
@@ -1786,6 +1804,9 @@
         <w:jc w:val="center"/>
       </w:pPr>
       <w:r>
+        <w:rPr>
+          <w:noProof/>
+        </w:rPr>
         <w:drawing>
           <wp:inline distT="0" distB="0" distL="0" distR="0" wp14:anchorId="55C2373B" wp14:editId="075ADE6E">
             <wp:extent cx="5379415" cy="2423160"/>
@@ -1853,6 +1874,9 @@
         <w:jc w:val="center"/>
       </w:pPr>
       <w:r>
+        <w:rPr>
+          <w:noProof/>
+        </w:rPr>
         <w:drawing>
           <wp:inline distT="0" distB="0" distL="0" distR="0" wp14:anchorId="6ACFB12D" wp14:editId="04736637">
             <wp:extent cx="5349240" cy="2014022"/>
@@ -1932,6 +1956,9 @@
         <w:jc w:val="center"/>
       </w:pPr>
       <w:r>
+        <w:rPr>
+          <w:noProof/>
+        </w:rPr>
         <w:drawing>
           <wp:inline distT="0" distB="0" distL="0" distR="0" wp14:anchorId="622D5FF9" wp14:editId="381EB295">
             <wp:extent cx="5303520" cy="5381007"/>
@@ -2009,6 +2036,9 @@
         <w:jc w:val="center"/>
       </w:pPr>
       <w:r>
+        <w:rPr>
+          <w:noProof/>
+        </w:rPr>
         <w:drawing>
           <wp:inline distT="0" distB="0" distL="0" distR="0" wp14:anchorId="6218D1FA" wp14:editId="432A9984">
             <wp:extent cx="5372100" cy="1767140"/>
@@ -2071,6 +2101,9 @@
         <w:jc w:val="center"/>
       </w:pPr>
       <w:r>
+        <w:rPr>
+          <w:noProof/>
+        </w:rPr>
         <w:drawing>
           <wp:inline distT="0" distB="0" distL="0" distR="0" wp14:anchorId="2BF2D3B3" wp14:editId="4A55658B">
             <wp:extent cx="5081270" cy="3445601"/>
@@ -2200,10 +2233,7 @@
         <w:pStyle w:val="medium"/>
       </w:pPr>
       <w:r>
-        <w:t>Hàm POST đăng nhập: Chịu trách nhiệm xác thực danh tính. Hàm sử dụng bcrypt.compare để đối chiếu mật khẩu người dùng nhập vào với mã băm trong Database. Nếu hợp lệ, hệ thống sử dụng thư viện jsonwebtoken để cấp phát một Thẻ thông hành (JWT Token) có thời hạn hiệu lực (ví dụ: 1 ngày). Token này được trả về Frontend để gắn vào các Request sau này, giúp duy trì phiên đăng nhập bảo mật</w:t>
-      </w:r>
-      <w:r>
-        <w:t>.</w:t>
+        <w:t>Hàm POST đăng nhập: Chịu trách nhiệm xác thực danh tính. Hàm sử dụng bcrypt.compare để đối chiếu mật khẩu người dùng nhập vào với mã băm trong Database. Nếu hợp lệ, hệ thống sử dụng thư viện jsonwebtoken để cấp phát một Thẻ thông hành (JWT Token) có thời hạn hiệu lực (ví dụ: 1 ngày). Token này được trả về Frontend để gắn vào các Request sau này, giúp duy trì phiên đăng nhập bảo mật.</w:t>
       </w:r>
     </w:p>
     <w:p>
@@ -2211,6 +2241,9 @@
         <w:jc w:val="center"/>
       </w:pPr>
       <w:r>
+        <w:rPr>
+          <w:noProof/>
+        </w:rPr>
         <w:drawing>
           <wp:inline distT="0" distB="0" distL="0" distR="0" wp14:anchorId="05B791D2" wp14:editId="7AA2F081">
             <wp:extent cx="5157216" cy="4572000"/>
@@ -2262,13 +2295,7 @@
       </w:pPr>
       <w:r>
         <w:lastRenderedPageBreak/>
-        <w:t xml:space="preserve"> Hàm POST quên mật khẩu</w:t>
-      </w:r>
-      <w:r>
-        <w:t xml:space="preserve">: </w:t>
-      </w:r>
-      <w:r>
-        <w:t>Tiếp nhận yêu cầu cấp lại mật khẩu. Nếu email tồn tại, hệ thống tự động sinh một mã OTP 6 chữ số ngẫu nhiên. Đồng thời, khởi tạo một mốc thời gian hết hạn 60 giây so với giờ hiện tại. Dữ liệu này được lưu tạm vào Database, sau đó hàm sẽ chuyển giao công việc cho module mailer.js để gửi email chứa OTP tới người dùng.</w:t>
+        <w:t xml:space="preserve"> Hàm POST quên mật khẩu: Tiếp nhận yêu cầu cấp lại mật khẩu. Nếu email tồn tại, hệ thống tự động sinh một mã OTP 6 chữ số ngẫu nhiên. Đồng thời, khởi tạo một mốc thời gian hết hạn 60 giây so với giờ hiện tại. Dữ liệu này được lưu tạm vào Database, sau đó hàm sẽ chuyển giao công việc cho module mailer.js để gửi email chứa OTP tới người dùng.</w:t>
       </w:r>
     </w:p>
     <w:p>
@@ -2276,6 +2303,9 @@
         <w:jc w:val="center"/>
       </w:pPr>
       <w:r>
+        <w:rPr>
+          <w:noProof/>
+        </w:rPr>
         <w:drawing>
           <wp:inline distT="0" distB="0" distL="0" distR="0" wp14:anchorId="2525A044" wp14:editId="3ED08C4B">
             <wp:extent cx="5650992" cy="4572000"/>
@@ -2330,13 +2360,7 @@
       </w:pPr>
       <w:r>
         <w:lastRenderedPageBreak/>
-        <w:t>Hàm POST đặt lại mật khẩu</w:t>
-      </w:r>
-      <w:r>
-        <w:t xml:space="preserve">: </w:t>
-      </w:r>
-      <w:r>
-        <w:t>Đóng vai trò là chốt chặn kiểm tra an ninh 3 lớp. Hàm sẽ xác thực: Người dùng có tồn tại không -&gt; Mã OTP nhập vào có khớp không -&gt; Thời gian hiện tại có vượt quá mốc 60 giây hết hạn hay không. Nếu vượt qua toàn bộ, hàm tiến hành băm mật khẩu mới để lưu đè lên mật khẩu cũ, đồng thời tiêu hủy mã OTP và thời gian hết hạn trong Database để phòng chống tấn công sử dụng lại mã (Replay Attack).</w:t>
+        <w:t>Hàm POST đặt lại mật khẩu: Đóng vai trò là chốt chặn kiểm tra an ninh 3 lớp. Hàm sẽ xác thực: Người dùng có tồn tại không -&gt; Mã OTP nhập vào có khớp không -&gt; Thời gian hiện tại có vượt quá mốc 60 giây hết hạn hay không. Nếu vượt qua toàn bộ, hàm tiến hành băm mật khẩu mới để lưu đè lên mật khẩu cũ, đồng thời tiêu hủy mã OTP và thời gian hết hạn trong Database để phòng chống tấn công sử dụng lại mã (Replay Attack).</w:t>
       </w:r>
     </w:p>
     <w:p>
@@ -2344,6 +2368,9 @@
         <w:jc w:val="center"/>
       </w:pPr>
       <w:r>
+        <w:rPr>
+          <w:noProof/>
+        </w:rPr>
         <w:drawing>
           <wp:inline distT="0" distB="0" distL="0" distR="0" wp14:anchorId="63689AC5" wp14:editId="2DAD78B4">
             <wp:extent cx="5943600" cy="3169285"/>
@@ -2386,6 +2413,9 @@
         <w:jc w:val="center"/>
       </w:pPr>
       <w:r>
+        <w:rPr>
+          <w:noProof/>
+        </w:rPr>
         <w:drawing>
           <wp:inline distT="0" distB="0" distL="0" distR="0" wp14:anchorId="32E2ECB2" wp14:editId="59234334">
             <wp:extent cx="5943600" cy="1913890"/>
@@ -2471,6 +2501,9 @@
         <w:jc w:val="center"/>
       </w:pPr>
       <w:r>
+        <w:rPr>
+          <w:noProof/>
+        </w:rPr>
         <w:drawing>
           <wp:inline distT="0" distB="0" distL="0" distR="0" wp14:anchorId="347BB5C7" wp14:editId="49EA1D64">
             <wp:extent cx="5440680" cy="4572000"/>
@@ -2530,6 +2563,9 @@
         <w:jc w:val="center"/>
       </w:pPr>
       <w:r>
+        <w:rPr>
+          <w:noProof/>
+        </w:rPr>
         <w:drawing>
           <wp:inline distT="0" distB="0" distL="0" distR="0" wp14:anchorId="54B5D012" wp14:editId="49F4A852">
             <wp:extent cx="6163056" cy="4572000"/>
@@ -2610,6 +2646,9 @@
         <w:jc w:val="center"/>
       </w:pPr>
       <w:r>
+        <w:rPr>
+          <w:noProof/>
+        </w:rPr>
         <w:drawing>
           <wp:inline distT="0" distB="0" distL="0" distR="0" wp14:anchorId="5ECB6982" wp14:editId="723133EB">
             <wp:extent cx="5020056" cy="3291840"/>
@@ -2691,6 +2730,9 @@
         </w:rPr>
       </w:pPr>
       <w:r>
+        <w:rPr>
+          <w:noProof/>
+        </w:rPr>
         <w:drawing>
           <wp:inline distT="0" distB="0" distL="0" distR="0" wp14:anchorId="3D0B2995" wp14:editId="64A1A64B">
             <wp:extent cx="4325112" cy="3291840"/>
@@ -2740,6 +2782,9 @@
         <w:jc w:val="center"/>
       </w:pPr>
       <w:r>
+        <w:rPr>
+          <w:noProof/>
+        </w:rPr>
         <w:drawing>
           <wp:inline distT="0" distB="0" distL="0" distR="0" wp14:anchorId="62BEA177" wp14:editId="6B873FB0">
             <wp:extent cx="4286250" cy="3025588"/>
@@ -2794,10 +2839,7 @@
       </w:r>
       <w:r>
         <w:lastRenderedPageBreak/>
-        <w:t>sẽ tự động trả về một gói JSON hoàn chỉnh bao gồm: Tiêu đề (Subject), Nội dung HTML đã trang trí (Body), Người nhận chính (Recipients) và Người đồng nhận (CC).</w:t>
-      </w:r>
-      <w:r>
-        <w:t xml:space="preserve"> </w:t>
+        <w:t xml:space="preserve">sẽ tự động trả về một gói JSON hoàn chỉnh bao gồm: Tiêu đề (Subject), Nội dung HTML đã trang trí (Body), Người nhận chính (Recipients) và Người đồng nhận (CC). </w:t>
       </w:r>
       <w:r>
         <w:t>C</w:t>
@@ -2877,13 +2919,7 @@
         <w:t xml:space="preserve">Tiếp nhận trạng thái trả về của Alert và gắn các định danh. </w:t>
       </w:r>
       <w:r>
-        <w:t xml:space="preserve">Bảo </w:t>
-      </w:r>
-      <w:r>
-        <w:t>vệ bởi một Middleware yêu cầu kiểm tra mã X-Webhook-Secret trong Header, giúp ngăn chặn triệt để nguy cơ tin tặc giả mạo hệ thống để tự ý đóng các sự cố nghiêm trọng</w:t>
-      </w:r>
-      <w:r>
-        <w:t>.</w:t>
+        <w:t>Bảo vệ bởi một Middleware yêu cầu kiểm tra mã X-Webhook-Secret trong Header, giúp ngăn chặn triệt để nguy cơ tin tặc giả mạo hệ thống để tự ý đóng các sự cố nghiêm trọng.</w:t>
       </w:r>
     </w:p>
     <w:p>
@@ -2919,6 +2955,9 @@
         <w:jc w:val="center"/>
       </w:pPr>
       <w:r>
+        <w:rPr>
+          <w:noProof/>
+        </w:rPr>
         <w:drawing>
           <wp:inline distT="0" distB="0" distL="0" distR="0" wp14:anchorId="57BD6609" wp14:editId="44B5FD71">
             <wp:extent cx="4396733" cy="2939142"/>
@@ -2956,6 +2995,9 @@
         </w:drawing>
       </w:r>
       <w:r>
+        <w:rPr>
+          <w:noProof/>
+        </w:rPr>
         <w:drawing>
           <wp:inline distT="0" distB="0" distL="0" distR="0" wp14:anchorId="5A0D9B91" wp14:editId="223C2DC0">
             <wp:extent cx="4397829" cy="2568221"/>
@@ -2993,6 +3035,9 @@
         </w:drawing>
       </w:r>
       <w:r>
+        <w:rPr>
+          <w:noProof/>
+        </w:rPr>
         <w:drawing>
           <wp:inline distT="0" distB="0" distL="0" distR="0" wp14:anchorId="50B65214" wp14:editId="38FE30A6">
             <wp:extent cx="4397829" cy="1449498"/>
@@ -3072,10 +3117,7 @@
         <w:t>Nếu phát hiện khai báo tài khoản EMAIL_USER trong file .env, hệ thống thiết lập kênh gửi thư bảo mật.</w:t>
       </w:r>
       <w:r>
-        <w:t xml:space="preserve"> </w:t>
-      </w:r>
-      <w:r>
-        <w:t>Nếu file .env thiếu mật khẩu, hệ thống tự động nhảy vào khối lệnh Fallback, không gọi API SMTP mà "vẽ" nguyên bản một khung Log trực quan in trực tiếp ra màn hình Terminal của máy chủ.</w:t>
+        <w:t xml:space="preserve"> Nếu file .env thiếu mật khẩu, hệ thống tự động nhảy vào khối lệnh Fallback, không gọi API SMTP mà "vẽ" nguyên bản một khung Log trực quan in trực tiếp ra màn hình Terminal của máy chủ.</w:t>
       </w:r>
     </w:p>
     <w:p>
@@ -3112,6 +3154,7 @@
         <w:rPr>
           <w:b/>
           <w:bCs/>
+          <w:noProof/>
         </w:rPr>
         <w:drawing>
           <wp:inline distT="0" distB="0" distL="0" distR="0" wp14:anchorId="11C47F8F" wp14:editId="4D149CD3">
@@ -3160,6 +3203,7 @@
         <w:rPr>
           <w:b/>
           <w:bCs/>
+          <w:noProof/>
         </w:rPr>
         <w:drawing>
           <wp:inline distT="0" distB="0" distL="0" distR="0" wp14:anchorId="2620ACE3" wp14:editId="52691870">
@@ -3224,6 +3268,9 @@
         <w:jc w:val="center"/>
       </w:pPr>
       <w:r>
+        <w:rPr>
+          <w:noProof/>
+        </w:rPr>
         <w:drawing>
           <wp:inline distT="0" distB="0" distL="0" distR="0" wp14:anchorId="67F1423A" wp14:editId="2CEC4F1D">
             <wp:extent cx="5943600" cy="3181985"/>
@@ -3261,6 +3308,9 @@
         </w:drawing>
       </w:r>
       <w:r>
+        <w:rPr>
+          <w:noProof/>
+        </w:rPr>
         <w:drawing>
           <wp:inline distT="0" distB="0" distL="0" distR="0" wp14:anchorId="22A0CC15" wp14:editId="4797DB57">
             <wp:extent cx="5943600" cy="1440180"/>
@@ -4686,6 +4736,7 @@
   <w:style w:type="character" w:default="1" w:styleId="DefaultParagraphFont">
     <w:name w:val="Default Paragraph Font"/>
     <w:uiPriority w:val="1"/>
+    <w:semiHidden/>
     <w:unhideWhenUsed/>
   </w:style>
   <w:style w:type="table" w:default="1" w:styleId="TableNormal">

</xml_diff>